<commit_message>
feat: add subject-area variants and streamline labs
</commit_message>
<xml_diff>
--- a/public/reports/LR01_template.docx
+++ b/public/reports/LR01_template.docx
@@ -2145,7 +2145,7 @@
                 <w:szCs w:val="19"/>
                 <w:color w:val="1C1C1C"/>
               </w:rPr>
-              <w:t>Компетенции</w:t>
+              <w:t>Максимальный балл</w:t>
             </w:r>
           </w:p>
         </w:tc>
@@ -2168,7 +2168,7 @@
                 <w:szCs w:val="19"/>
                 <w:color w:val="1C1C1C"/>
               </w:rPr>
-              <w:t>ОК 01, ПК 4.3, ПК 4.4</w:t>
+              <w:t>5</w:t>
             </w:r>
           </w:p>
         </w:tc>
@@ -2184,7 +2184,7 @@
           </w:tcPr>
           <w:p>
             <w:pPr>
-              <w:jc w:val="center"/>
+              <w:jc w:val="left"/>
               <w:spacing w:before="0" w:after="0" w:line="240" w:lineRule="auto"/>
               <w:keepLines/>
             </w:pPr>
@@ -2197,7 +2197,7 @@
                 <w:szCs w:val="19"/>
                 <w:color w:val="1C1C1C"/>
               </w:rPr>
-              <w:t>Максимальный балл</w:t>
+              <w:t>Предметная область</w:t>
             </w:r>
           </w:p>
         </w:tc>
@@ -2217,9 +2217,9 @@
                 <w:rFonts w:ascii="Times New Roman" w:hAnsi="Times New Roman" w:eastAsia="Times New Roman" w:cs="Times New Roman"/>
                 <w:sz w:val="19"/>
                 <w:szCs w:val="19"/>
-                <w:color w:val="1C1C1C"/>
-              </w:rPr>
-              <w:t>5</w:t>
+                <w:color w:val="77777F"/>
+              </w:rPr>
+              <w:t>[Укажите сквозной вариант SA01–SA30 и название]</w:t>
             </w:r>
           </w:p>
         </w:tc>

</xml_diff>

<commit_message>
feat: improve lab workflow and personalized packages
</commit_message>
<xml_diff>
--- a/public/reports/LR01_template.docx
+++ b/public/reports/LR01_template.docx
@@ -7118,8 +7118,8 @@
                 <w:rFonts w:ascii="Times New Roman" w:hAnsi="Times New Roman" w:eastAsia="Times New Roman" w:cs="Times New Roman"/>
                 <w:b/>
                 <w:bCs/>
-                <w:sz w:val="18"/>
-                <w:szCs w:val="18"/>
+                <w:sz w:val="17"/>
+                <w:szCs w:val="17"/>
                 <w:color w:val="FFFFFF"/>
               </w:rPr>
               <w:t>Отметка</w:t>
@@ -7143,11 +7143,11 @@
                 <w:rFonts w:ascii="Times New Roman" w:hAnsi="Times New Roman" w:eastAsia="Times New Roman" w:cs="Times New Roman"/>
                 <w:b/>
                 <w:bCs/>
-                <w:sz w:val="18"/>
-                <w:szCs w:val="18"/>
+                <w:sz w:val="17"/>
+                <w:szCs w:val="17"/>
                 <w:color w:val="FFFFFF"/>
               </w:rPr>
-              <w:t>Контрольный вопрос</w:t>
+              <w:t>Проверяемое утверждение</w:t>
             </w:r>
           </w:p>
         </w:tc>
@@ -7168,8 +7168,8 @@
                 <w:rFonts w:ascii="Times New Roman" w:hAnsi="Times New Roman" w:eastAsia="Times New Roman" w:cs="Times New Roman"/>
                 <w:b/>
                 <w:bCs/>
-                <w:sz w:val="18"/>
-                <w:szCs w:val="18"/>
+                <w:sz w:val="17"/>
+                <w:szCs w:val="17"/>
                 <w:color w:val="FFFFFF"/>
               </w:rPr>
               <w:t>Комментарий</w:t>
@@ -7195,8 +7195,8 @@
             <w:r>
               <w:rPr>
                 <w:rFonts w:ascii="Times New Roman" w:hAnsi="Times New Roman" w:eastAsia="Times New Roman" w:cs="Times New Roman"/>
-                <w:sz w:val="18"/>
-                <w:szCs w:val="18"/>
+                <w:sz w:val="17"/>
+                <w:szCs w:val="17"/>
                 <w:color w:val="1C1C1C"/>
               </w:rPr>
               <w:t>☐</w:t>
@@ -7217,11 +7217,11 @@
             <w:r>
               <w:rPr>
                 <w:rFonts w:ascii="Times New Roman" w:hAnsi="Times New Roman" w:eastAsia="Times New Roman" w:cs="Times New Roman"/>
-                <w:sz w:val="18"/>
-                <w:szCs w:val="18"/>
+                <w:sz w:val="17"/>
+                <w:szCs w:val="17"/>
                 <w:color w:val="1C1C1C"/>
               </w:rPr>
-              <w:t>Все ли записи E01–E12 рассмотрены?</w:t>
+              <w:t>Рассмотрены все записи E01–E12, каждая сохранена в результате с исходным ID.</w:t>
             </w:r>
           </w:p>
         </w:tc>
@@ -7239,8 +7239,8 @@
             <w:r>
               <w:rPr>
                 <w:rFonts w:ascii="Times New Roman" w:hAnsi="Times New Roman" w:eastAsia="Times New Roman" w:cs="Times New Roman"/>
-                <w:sz w:val="18"/>
-                <w:szCs w:val="18"/>
+                <w:sz w:val="17"/>
+                <w:szCs w:val="17"/>
                 <w:color w:val="77777F"/>
               </w:rPr>
               <w:t>[Примечание при необходимости]</w:t>
@@ -7267,8 +7267,8 @@
             <w:r>
               <w:rPr>
                 <w:rFonts w:ascii="Times New Roman" w:hAnsi="Times New Roman" w:eastAsia="Times New Roman" w:cs="Times New Roman"/>
-                <w:sz w:val="18"/>
-                <w:szCs w:val="18"/>
+                <w:sz w:val="17"/>
+                <w:szCs w:val="17"/>
                 <w:color w:val="1C1C1C"/>
               </w:rPr>
               <w:t>☐</w:t>
@@ -7290,11 +7290,11 @@
             <w:r>
               <w:rPr>
                 <w:rFonts w:ascii="Times New Roman" w:hAnsi="Times New Roman" w:eastAsia="Times New Roman" w:cs="Times New Roman"/>
-                <w:sz w:val="18"/>
-                <w:szCs w:val="18"/>
+                <w:sz w:val="17"/>
+                <w:szCs w:val="17"/>
                 <w:color w:val="1C1C1C"/>
               </w:rPr>
-              <w:t>Отделены ли причины и признаки от проявившихся отказов?</w:t>
+              <w:t>Причины и признаки отделены от проявившихся отказов.</w:t>
             </w:r>
           </w:p>
         </w:tc>
@@ -7313,8 +7313,8 @@
             <w:r>
               <w:rPr>
                 <w:rFonts w:ascii="Times New Roman" w:hAnsi="Times New Roman" w:eastAsia="Times New Roman" w:cs="Times New Roman"/>
-                <w:sz w:val="18"/>
-                <w:szCs w:val="18"/>
+                <w:sz w:val="17"/>
+                <w:szCs w:val="17"/>
                 <w:color w:val="77777F"/>
               </w:rPr>
               <w:t>[Примечание при необходимости]</w:t>
@@ -7340,8 +7340,8 @@
             <w:r>
               <w:rPr>
                 <w:rFonts w:ascii="Times New Roman" w:hAnsi="Times New Roman" w:eastAsia="Times New Roman" w:cs="Times New Roman"/>
-                <w:sz w:val="18"/>
-                <w:szCs w:val="18"/>
+                <w:sz w:val="17"/>
+                <w:szCs w:val="17"/>
                 <w:color w:val="1C1C1C"/>
               </w:rPr>
               <w:t>☐</w:t>
@@ -7362,11 +7362,11 @@
             <w:r>
               <w:rPr>
                 <w:rFonts w:ascii="Times New Roman" w:hAnsi="Times New Roman" w:eastAsia="Times New Roman" w:cs="Times New Roman"/>
-                <w:sz w:val="18"/>
-                <w:szCs w:val="18"/>
+                <w:sz w:val="17"/>
+                <w:szCs w:val="17"/>
                 <w:color w:val="1C1C1C"/>
               </w:rPr>
-              <w:t>Опирается ли каждое спорное решение на наблюдаемый эффект?</w:t>
+              <w:t>Каждое спорное решение опирается на наблюдаемый эффект и требуемую функцию.</w:t>
             </w:r>
           </w:p>
         </w:tc>
@@ -7384,8 +7384,8 @@
             <w:r>
               <w:rPr>
                 <w:rFonts w:ascii="Times New Roman" w:hAnsi="Times New Roman" w:eastAsia="Times New Roman" w:cs="Times New Roman"/>
-                <w:sz w:val="18"/>
-                <w:szCs w:val="18"/>
+                <w:sz w:val="17"/>
+                <w:szCs w:val="17"/>
                 <w:color w:val="77777F"/>
               </w:rPr>
               <w:t>[Примечание при необходимости]</w:t>
@@ -7412,8 +7412,8 @@
             <w:r>
               <w:rPr>
                 <w:rFonts w:ascii="Times New Roman" w:hAnsi="Times New Roman" w:eastAsia="Times New Roman" w:cs="Times New Roman"/>
-                <w:sz w:val="18"/>
-                <w:szCs w:val="18"/>
+                <w:sz w:val="17"/>
+                <w:szCs w:val="17"/>
                 <w:color w:val="1C1C1C"/>
               </w:rPr>
               <w:t>☐</w:t>
@@ -7435,11 +7435,11 @@
             <w:r>
               <w:rPr>
                 <w:rFonts w:ascii="Times New Roman" w:hAnsi="Times New Roman" w:eastAsia="Times New Roman" w:cs="Times New Roman"/>
-                <w:sz w:val="18"/>
-                <w:szCs w:val="18"/>
+                <w:sz w:val="17"/>
+                <w:szCs w:val="17"/>
                 <w:color w:val="1C1C1C"/>
               </w:rPr>
-              <w:t>Не признано ли штатное событие нарушением без доказательства?</w:t>
+              <w:t>Штатные события не признаны нарушениями без доказательства.</w:t>
             </w:r>
           </w:p>
         </w:tc>
@@ -7458,8 +7458,8 @@
             <w:r>
               <w:rPr>
                 <w:rFonts w:ascii="Times New Roman" w:hAnsi="Times New Roman" w:eastAsia="Times New Roman" w:cs="Times New Roman"/>
-                <w:sz w:val="18"/>
-                <w:szCs w:val="18"/>
+                <w:sz w:val="17"/>
+                <w:szCs w:val="17"/>
                 <w:color w:val="77777F"/>
               </w:rPr>
               <w:t>[Примечание при необходимости]</w:t>
@@ -7485,8 +7485,8 @@
             <w:r>
               <w:rPr>
                 <w:rFonts w:ascii="Times New Roman" w:hAnsi="Times New Roman" w:eastAsia="Times New Roman" w:cs="Times New Roman"/>
-                <w:sz w:val="18"/>
-                <w:szCs w:val="18"/>
+                <w:sz w:val="17"/>
+                <w:szCs w:val="17"/>
                 <w:color w:val="1C1C1C"/>
               </w:rPr>
               <w:t>☐</w:t>
@@ -7507,11 +7507,11 @@
             <w:r>
               <w:rPr>
                 <w:rFonts w:ascii="Times New Roman" w:hAnsi="Times New Roman" w:eastAsia="Times New Roman" w:cs="Times New Roman"/>
-                <w:sz w:val="18"/>
-                <w:szCs w:val="18"/>
+                <w:sz w:val="17"/>
+                <w:szCs w:val="17"/>
                 <w:color w:val="1C1C1C"/>
               </w:rPr>
-              <w:t>Следует ли первоочередное действие из сводки?</w:t>
+              <w:t>Первоочередное действие следует из сводки по источникам и масштабу влияния.</w:t>
             </w:r>
           </w:p>
         </w:tc>
@@ -7529,8 +7529,8 @@
             <w:r>
               <w:rPr>
                 <w:rFonts w:ascii="Times New Roman" w:hAnsi="Times New Roman" w:eastAsia="Times New Roman" w:cs="Times New Roman"/>
-                <w:sz w:val="18"/>
-                <w:szCs w:val="18"/>
+                <w:sz w:val="17"/>
+                <w:szCs w:val="17"/>
                 <w:color w:val="77777F"/>
               </w:rPr>
               <w:t>[Примечание при необходимости]</w:t>
@@ -7578,12 +7578,6 @@
           <w:color w:val="77777F"/>
         </w:rPr>
         <w:t>[Сформулируйте профессиональный вывод: что установлено, соответствует ли результат требованию, какое решение принято и на каких доказательствах оно основано. Не пересказывайте теорию.]</w:t>
-      </w:r>
-      <w:r>
-        <w:br/>
-      </w:r>
-      <w:r>
-        <w:br/>
       </w:r>
       <w:r>
         <w:br/>

</xml_diff>